<commit_message>
Rewrite design-intent doc and build log: no em dashes, human voice
Also cleaned em/en dashes from SUBMISSION.md and README for consistency.
Design-intent doc rewritten in plain language (495 words, still text-only,
under 500). Build log rewritten in first-person dev-log voice with every pass
preserved. Facts refreshed (packaging ~179 KB, current balance gradient,
actual verification scripts).

Co-Authored-By: Claude Opus 4.8 <noreply@anthropic.com>
Claude-Session: https://claude.ai/code/session_011riwCWEd5SJa4tyXHgTCHC
</commit_message>
<xml_diff>
--- a/DESIGN_INTENT.docx
+++ b/DESIGN_INTENT.docx
@@ -7,7 +7,7 @@
         <w:pStyle w:val="Title"/>
       </w:pPr>
       <w:r>
-        <w:t xml:space="preserve">EMBER — Design-Intent Document</w:t>
+        <w:t xml:space="preserve">EMBER Design-Intent Document</w:t>
       </w:r>
     </w:p>
     <w:p>
@@ -43,7 +43,7 @@
           <w:sz w:val="22"/>
           <w:szCs w:val="22"/>
         </w:rPr>
-        <w:t xml:space="preserve">Ember is for mobile players who want short, tense, replayable runs — the “one more go” crowd. Think fans of arcade survival and roguelites who play in portrait, one-handed, for a few minutes at a time, and come back to beat their best score. It assumes no manual: the rules read from the first screen, and a full run lasts three to five minutes.</w:t>
+        <w:t xml:space="preserve">Ember is for mobile players who want short, tense runs they can replay, the "one more go" crowd. Think fans of arcade survival and roguelites who play in portrait, one handed, and keep coming back to beat their best score. It needs no manual. You can read the rules off the first screen, and a full run lasts about three to five minutes.</w:t>
       </w:r>
     </w:p>
     <w:p>
@@ -64,7 +64,7 @@
           <w:sz w:val="22"/>
           <w:szCs w:val="22"/>
         </w:rPr>
-        <w:t xml:space="preserve">Your campfire is the only thing holding back the dark — and it is everything at once: your light, your warmth, your currency, and your only weapon. You leave its safety to chop wood and bring it back; the wood feeds the fire directly, so it burns brighter, reaches further, and keeps you alive. Upgrades are bought by spending the fire’s own strength — every purchase is a real sacrifice. At night, shades crawl from the dark to drain the fire; a well-fed fire burns them, and you can swing your torch to beat back any that slip through. The design collapses the survival genre’s gather–craft–defend loop onto a single resource, so every trade-off is felt. It is rendered in 3D so the fire is a real, flickering light that casts dynamic shadows.</w:t>
+        <w:t xml:space="preserve">Your campfire is the only thing holding back the dark, and it is everything at once. It is your light, your warmth, your money, and your only weapon. You leave its safety to chop wood and carry it back. The wood feeds the fire directly, so it burns brighter, reaches farther, and keeps you alive. Upgrades cost the fire’s own strength, so every purchase is a real sacrifice. At night, shades crawl out of the dark to drain the fire. A well fed fire burns them, and you can swing your torch at any that get close. The whole gather, craft, and defend loop runs on that one resource, so every trade off is felt. It is built in 3D, so the fire is a real flickering light that casts moving shadows.</w:t>
       </w:r>
     </w:p>
     <w:p>
@@ -85,7 +85,7 @@
           <w:sz w:val="22"/>
           <w:szCs w:val="22"/>
         </w:rPr>
-        <w:t xml:space="preserve">A complete, tuned core loop — gather, bank, feed or upgrade, survive — across five escalating nights with clear win, lose, and restart states — and, after that first victory, an optional endless mode where the nights never stop and the score climbs until you fall — and constant, visible reward throughout: floating numbers pop from every chop, kill and feed, and a momentum combo multiplies a bonus score and rewards aggressive play with more drops. The fire visibly scales with fuel, and meters, banners and warnings keep the state legible. Progression runs on two layers: four permanent wood-bought upgrades, and a between-nights “level up” where you choose one of three run boons. Ability drops unlock as the nights escalate — Inferno, Swift, Ward, Harvest, a screen-clearing Nova, a slingshot, telekinesis, a chainsaw, a Human Torch, a screen-wide Super Nova, and a toolbelt. A Brute and player-hunting irregulars — which only the slingshot or the fire can kill — join the shades on later nights, and the fire burns hotter and bluer the deeper you go. You roam the whole frame freely, so every tree is reachable — leaving the fire is always your own gamble. It has a persistent best score, a triumphant sunrise on a win and a bleak fade-to-dark on a loss, and fully synthesized audio with a chiptune score. It runs entirely offline from one readable index.html plus the Three.js library.</w:t>
+        <w:t xml:space="preserve">This is a complete, tuned core loop. You gather, feed or upgrade, and survive across five nights that keep getting harder, with clear win, lose, and restart screens. After that first win, an optional endless mode lets the nights keep going while your score climbs until you fall. Every action pays off on screen with floating numbers, and a momentum combo builds a bonus score that rewards aggressive play. The fire grows with fuel, and the meters, banners, and warnings keep everything readable. Progression runs on two layers. There are four permanent upgrades bought with the fire’s fuel, and a between nights pick where you choose one of three run boons. A dozen power ups unlock as the nights get deeper, from a slingshot that fires your wood to a screen wide Super Nova that torches everything. A tanky Brute and player hunting irregulars, which only the slingshot or the fire can kill, join the shades on later nights, and the fire burns hotter and bluer as you go. You roam the whole screen freely, so every tree is reachable, and leaving the fire is always your own gamble. It keeps a best score, gives a sunrise on a win and a fade to dark on a loss, and all its audio is synthesized, including a chiptune track. It runs fully offline from one readable index.html plus the Three.js library.</w:t>
       </w:r>
     </w:p>
     <w:p>
@@ -106,7 +106,7 @@
           <w:sz w:val="22"/>
           <w:szCs w:val="22"/>
         </w:rPr>
-        <w:t xml:space="preserve">The core is a foundation for a deep survival roguelite: more environments and longer arcs; a varied enemy roster and boss nights; deeper boon trees with synergies and build identity; meta-progression between runs; and daily seeds with leaderboards to fuel the score-chase. The pillar stays fixed — one fire that is light, warmth, wealth, and weapon — with everything new deepening that single, legible tension.</w:t>
+        <w:t xml:space="preserve">The core is a strong base for a deeper survival roguelite. We would add more environments and longer runs, a wider set of enemies and boss nights, deeper boon trees with real build identity, meta progression between runs, and daily seeds with leaderboards. The one thing that stays fixed is the pillar. One fire that is your light, warmth, money, and weapon, with everything new making that single idea richer.</w:t>
       </w:r>
     </w:p>
     <w:sectPr>

</xml_diff>

<commit_message>
Tighten Design-Intent doc under 500 words (inclusive count)
Trim the body so the whole document, counting title, subtitle and
headings, lands at 488 words with margin. No dashes, no identifying info.

Co-Authored-By: Claude Opus 4.8 <noreply@anthropic.com>
Claude-Session: https://claude.ai/code/session_011riwCWEd5SJa4tyXHgTCHC
</commit_message>
<xml_diff>
--- a/DESIGN_INTENT.docx
+++ b/DESIGN_INTENT.docx
@@ -43,7 +43,7 @@
           <w:sz w:val="22"/>
           <w:szCs w:val="22"/>
         </w:rPr>
-        <w:t xml:space="preserve">Ember is for mobile players who want short, tense runs they can replay, the "one more go" crowd. Think fans of arcade survival and roguelites who play in portrait, one handed, and keep coming back to beat their best score. It needs no manual. You can read the rules off the first screen, and a full run lasts about three to five minutes.</w:t>
+        <w:t xml:space="preserve">Ember is for mobile players who want short, tense runs they can replay, the "one more go" crowd. Think fans of arcade survival and roguelites who play in portrait, one handed, and keep coming back to beat their best score. It needs no manual, and a full run lasts about three to five minutes.</w:t>
       </w:r>
     </w:p>
     <w:p>
@@ -85,7 +85,7 @@
           <w:sz w:val="22"/>
           <w:szCs w:val="22"/>
         </w:rPr>
-        <w:t xml:space="preserve">This is a complete, tuned core loop. You gather, feed or upgrade, and survive across five nights that keep getting harder, with clear win, lose, and restart screens. After that first win, an optional endless mode lets the nights keep going while your score climbs until you fall. Every action pays off on screen with floating numbers, and a momentum combo builds a bonus score that rewards aggressive play. The fire grows with fuel, and the meters, banners, and warnings keep everything readable. Progression runs on two layers. There are four permanent upgrades bought with the fire’s fuel, and a between nights pick where you choose one of three run boons. Eleven power ups unlock as the nights get deeper, from a slingshot that fires your wood to a screen wide Super Nova that torches everything. A tanky Brute and player hunting irregulars, which only the slingshot or the fire can kill, join the shades on later nights, and the fire burns hotter and bluer as you go. You roam the whole screen freely, so every tree is reachable, and leaving the fire is always your own gamble. It keeps a best score, gives a sunrise on a win and a fade to dark on a loss, and all its audio is synthesized, including a chiptune track. It runs fully offline from one readable index.html plus the Three.js library.</w:t>
+        <w:t xml:space="preserve">This is a complete, tuned core loop. You gather, feed or upgrade, and survive five nights that keep getting harder, with clear win, lose, and restart screens. After that first win, an optional endless mode lets the nights keep going while your score climbs. Every action pays off on screen with floating numbers, and a momentum combo builds a bonus that rewards aggressive play. The fire grows with fuel, and the meters and warnings stay readable. Progression runs on two layers: four permanent upgrades bought with the fire’s fuel, and a between nights pick of one of three run boons. Eleven power ups unlock as the nights deepen, from a slingshot that fires your wood to a screen wide Super Nova that torches everything. A tanky Brute and player hunting irregulars, killable only by the slingshot or the fire, join the shades on later nights, and the fire burns hotter and bluer as you go. You roam the whole screen freely, so every tree is reachable and leaving the fire is always a gamble. It keeps a best score, gives a sunrise on a win and a fade to dark on a loss, and its audio is fully synthesized, including a chiptune track. It runs offline from one readable index.html plus the Three.js library.</w:t>
       </w:r>
     </w:p>
     <w:p>
@@ -106,7 +106,7 @@
           <w:sz w:val="22"/>
           <w:szCs w:val="22"/>
         </w:rPr>
-        <w:t xml:space="preserve">The core is a strong base for a deeper survival roguelite. We would add more environments and longer runs, a wider set of enemies and boss nights, deeper boon trees with real build identity, meta progression between runs, and daily seeds with leaderboards. The one thing that stays fixed is the pillar. One fire that is your light, warmth, money, and weapon, with everything new making that single idea richer.</w:t>
+        <w:t xml:space="preserve">The core is a strong base for a deeper survival roguelite. We would add more environments and longer runs, a wider set of enemies and boss nights, deeper boon trees, meta progression between runs, and daily seeds with leaderboards. The pillar stays fixed. One fire that is your light, warmth, money, and weapon, with everything new making that single idea richer.</w:t>
       </w:r>
     </w:p>
     <w:sectPr>

</xml_diff>